<commit_message>
informe inteligente a medias
</commit_message>
<xml_diff>
--- a/plantillas_word/documentos_legales/CONTRATO DE TRABAJO 2026.docx
+++ b/plantillas_word/documentos_legales/CONTRATO DE TRABAJO 2026.docx
@@ -341,29 +341,7 @@
           <w:u w:val="single"/>
           <w:lang w:eastAsia="es-ES"/>
         </w:rPr>
-        <w:t xml:space="preserve">{ </w:t>
-      </w:r>
-      <w:proofErr w:type="spellStart"/>
-      <w:r>
-        <w:rPr>
-          <w:rFonts w:ascii="Arial" w:eastAsia="Times New Roman" w:hAnsi="Arial" w:cs="Arial"/>
-          <w:sz w:val="20"/>
-          <w:szCs w:val="20"/>
-          <w:u w:val="single"/>
-          <w:lang w:eastAsia="es-ES"/>
-        </w:rPr>
-        <w:t>empleador_nombre</w:t>
-      </w:r>
-      <w:proofErr w:type="spellEnd"/>
-      <w:r>
-        <w:rPr>
-          <w:rFonts w:ascii="Arial" w:eastAsia="Times New Roman" w:hAnsi="Arial" w:cs="Arial"/>
-          <w:sz w:val="20"/>
-          <w:szCs w:val="20"/>
-          <w:u w:val="single"/>
-          <w:lang w:eastAsia="es-ES"/>
-        </w:rPr>
-        <w:t xml:space="preserve"> }}  </w:t>
+        <w:t xml:space="preserve">{ empleador_nombre }}  </w:t>
       </w:r>
       <w:r>
         <w:rPr>
@@ -410,29 +388,7 @@
           <w:u w:val="single"/>
           <w:lang w:eastAsia="es-ES"/>
         </w:rPr>
-        <w:t xml:space="preserve">{{ </w:t>
-      </w:r>
-      <w:proofErr w:type="spellStart"/>
-      <w:r>
-        <w:rPr>
-          <w:rFonts w:ascii="Arial" w:eastAsia="Times New Roman" w:hAnsi="Arial" w:cs="Arial"/>
-          <w:sz w:val="20"/>
-          <w:szCs w:val="20"/>
-          <w:u w:val="single"/>
-          <w:lang w:eastAsia="es-ES"/>
-        </w:rPr>
-        <w:t>empleador_cargo</w:t>
-      </w:r>
-      <w:proofErr w:type="spellEnd"/>
-      <w:r>
-        <w:rPr>
-          <w:rFonts w:ascii="Arial" w:eastAsia="Times New Roman" w:hAnsi="Arial" w:cs="Arial"/>
-          <w:sz w:val="20"/>
-          <w:szCs w:val="20"/>
-          <w:u w:val="single"/>
-          <w:lang w:eastAsia="es-ES"/>
-        </w:rPr>
-        <w:t xml:space="preserve"> }}  </w:t>
+        <w:t xml:space="preserve">{{ empleador_cargo }}  </w:t>
       </w:r>
       <w:r>
         <w:rPr>
@@ -498,29 +454,7 @@
           <w:u w:val="single"/>
           <w:lang w:eastAsia="es-ES"/>
         </w:rPr>
-        <w:t xml:space="preserve">{{ </w:t>
-      </w:r>
-      <w:proofErr w:type="spellStart"/>
-      <w:r>
-        <w:rPr>
-          <w:rFonts w:ascii="Arial" w:eastAsia="Times New Roman" w:hAnsi="Arial" w:cs="Arial"/>
-          <w:sz w:val="20"/>
-          <w:szCs w:val="20"/>
-          <w:u w:val="single"/>
-          <w:lang w:eastAsia="es-ES"/>
-        </w:rPr>
-        <w:t>entidad_nombre</w:t>
-      </w:r>
-      <w:proofErr w:type="spellEnd"/>
-      <w:r>
-        <w:rPr>
-          <w:rFonts w:ascii="Arial" w:eastAsia="Times New Roman" w:hAnsi="Arial" w:cs="Arial"/>
-          <w:sz w:val="20"/>
-          <w:szCs w:val="20"/>
-          <w:u w:val="single"/>
-          <w:lang w:eastAsia="es-ES"/>
-        </w:rPr>
-        <w:t xml:space="preserve"> }}  </w:t>
+        <w:t xml:space="preserve">{{ entidad_nombre }}  </w:t>
       </w:r>
       <w:r>
         <w:rPr>
@@ -659,9 +593,9 @@
                 <w:szCs w:val="20"/>
                 <w:lang w:eastAsia="es-ES"/>
               </w:rPr>
-              <w:t xml:space="preserve">{{ </w:t>
-            </w:r>
-            <w:proofErr w:type="spellStart"/>
+              <w:t>{{ entidad</w:t>
+            </w:r>
+            <w:proofErr w:type="gramEnd"/>
             <w:r>
               <w:rPr>
                 <w:rFonts w:ascii="Arial" w:eastAsia="Times New Roman" w:hAnsi="Arial" w:cs="Arial"/>
@@ -669,27 +603,7 @@
                 <w:szCs w:val="20"/>
                 <w:lang w:eastAsia="es-ES"/>
               </w:rPr>
-              <w:t>entidad</w:t>
-            </w:r>
-            <w:proofErr w:type="gramEnd"/>
-            <w:r>
-              <w:rPr>
-                <w:rFonts w:ascii="Arial" w:eastAsia="Times New Roman" w:hAnsi="Arial" w:cs="Arial"/>
-                <w:sz w:val="20"/>
-                <w:szCs w:val="20"/>
-                <w:lang w:eastAsia="es-ES"/>
-              </w:rPr>
-              <w:t>_nombre</w:t>
-            </w:r>
-            <w:proofErr w:type="spellEnd"/>
-            <w:r>
-              <w:rPr>
-                <w:rFonts w:ascii="Arial" w:eastAsia="Times New Roman" w:hAnsi="Arial" w:cs="Arial"/>
-                <w:sz w:val="20"/>
-                <w:szCs w:val="20"/>
-                <w:lang w:eastAsia="es-ES"/>
-              </w:rPr>
-              <w:t xml:space="preserve"> }}</w:t>
+              <w:t>_nombre }}</w:t>
             </w:r>
           </w:p>
         </w:tc>
@@ -737,9 +651,9 @@
                 <w:szCs w:val="20"/>
                 <w:lang w:eastAsia="es-ES"/>
               </w:rPr>
-              <w:t xml:space="preserve">{{ </w:t>
-            </w:r>
-            <w:proofErr w:type="spellStart"/>
+              <w:t>{{ entidad</w:t>
+            </w:r>
+            <w:proofErr w:type="gramEnd"/>
             <w:r>
               <w:rPr>
                 <w:rFonts w:ascii="Arial" w:eastAsia="Times New Roman" w:hAnsi="Arial" w:cs="Arial"/>
@@ -747,27 +661,7 @@
                 <w:szCs w:val="20"/>
                 <w:lang w:eastAsia="es-ES"/>
               </w:rPr>
-              <w:t>entidad</w:t>
-            </w:r>
-            <w:proofErr w:type="gramEnd"/>
-            <w:r>
-              <w:rPr>
-                <w:rFonts w:ascii="Arial" w:eastAsia="Times New Roman" w:hAnsi="Arial" w:cs="Arial"/>
-                <w:sz w:val="20"/>
-                <w:szCs w:val="20"/>
-                <w:lang w:eastAsia="es-ES"/>
-              </w:rPr>
-              <w:t>_direccion</w:t>
-            </w:r>
-            <w:proofErr w:type="spellEnd"/>
-            <w:r>
-              <w:rPr>
-                <w:rFonts w:ascii="Arial" w:eastAsia="Times New Roman" w:hAnsi="Arial" w:cs="Arial"/>
-                <w:sz w:val="20"/>
-                <w:szCs w:val="20"/>
-                <w:lang w:eastAsia="es-ES"/>
-              </w:rPr>
-              <w:t xml:space="preserve"> }}</w:t>
+              <w:t>_direccion }}</w:t>
             </w:r>
           </w:p>
         </w:tc>
@@ -818,9 +712,9 @@
                 <w:szCs w:val="20"/>
                 <w:lang w:eastAsia="es-ES"/>
               </w:rPr>
-              <w:t xml:space="preserve">{{ </w:t>
-            </w:r>
-            <w:proofErr w:type="spellStart"/>
+              <w:t>{{ entidad</w:t>
+            </w:r>
+            <w:proofErr w:type="gramEnd"/>
             <w:r>
               <w:rPr>
                 <w:rFonts w:ascii="Arial" w:eastAsia="Times New Roman" w:hAnsi="Arial" w:cs="Arial"/>
@@ -828,27 +722,7 @@
                 <w:szCs w:val="20"/>
                 <w:lang w:eastAsia="es-ES"/>
               </w:rPr>
-              <w:t>entidad</w:t>
-            </w:r>
-            <w:proofErr w:type="gramEnd"/>
-            <w:r>
-              <w:rPr>
-                <w:rFonts w:ascii="Arial" w:eastAsia="Times New Roman" w:hAnsi="Arial" w:cs="Arial"/>
-                <w:sz w:val="20"/>
-                <w:szCs w:val="20"/>
-                <w:lang w:eastAsia="es-ES"/>
-              </w:rPr>
-              <w:t>_provincia</w:t>
-            </w:r>
-            <w:proofErr w:type="spellEnd"/>
-            <w:r>
-              <w:rPr>
-                <w:rFonts w:ascii="Arial" w:eastAsia="Times New Roman" w:hAnsi="Arial" w:cs="Arial"/>
-                <w:sz w:val="20"/>
-                <w:szCs w:val="20"/>
-                <w:lang w:eastAsia="es-ES"/>
-              </w:rPr>
-              <w:t xml:space="preserve"> }}</w:t>
+              <w:t>_provincia }}</w:t>
             </w:r>
           </w:p>
         </w:tc>
@@ -893,9 +767,9 @@
                 <w:szCs w:val="20"/>
                 <w:lang w:eastAsia="es-ES"/>
               </w:rPr>
-              <w:t xml:space="preserve">{{ </w:t>
-            </w:r>
-            <w:proofErr w:type="spellStart"/>
+              <w:t>{{ entidad</w:t>
+            </w:r>
+            <w:proofErr w:type="gramEnd"/>
             <w:r>
               <w:rPr>
                 <w:rFonts w:ascii="Arial" w:eastAsia="Times New Roman" w:hAnsi="Arial" w:cs="Arial"/>
@@ -903,27 +777,7 @@
                 <w:szCs w:val="20"/>
                 <w:lang w:eastAsia="es-ES"/>
               </w:rPr>
-              <w:t>entidad</w:t>
-            </w:r>
-            <w:proofErr w:type="gramEnd"/>
-            <w:r>
-              <w:rPr>
-                <w:rFonts w:ascii="Arial" w:eastAsia="Times New Roman" w:hAnsi="Arial" w:cs="Arial"/>
-                <w:sz w:val="20"/>
-                <w:szCs w:val="20"/>
-                <w:lang w:eastAsia="es-ES"/>
-              </w:rPr>
-              <w:t>_municipio</w:t>
-            </w:r>
-            <w:proofErr w:type="spellEnd"/>
-            <w:r>
-              <w:rPr>
-                <w:rFonts w:ascii="Arial" w:eastAsia="Times New Roman" w:hAnsi="Arial" w:cs="Arial"/>
-                <w:sz w:val="20"/>
-                <w:szCs w:val="20"/>
-                <w:lang w:eastAsia="es-ES"/>
-              </w:rPr>
-              <w:t xml:space="preserve"> }}</w:t>
+              <w:t>_municipio }}</w:t>
             </w:r>
           </w:p>
         </w:tc>
@@ -968,9 +822,9 @@
                 <w:szCs w:val="20"/>
                 <w:lang w:eastAsia="es-ES"/>
               </w:rPr>
-              <w:t xml:space="preserve">{{ </w:t>
-            </w:r>
-            <w:proofErr w:type="spellStart"/>
+              <w:t>{{ entidad</w:t>
+            </w:r>
+            <w:proofErr w:type="gramEnd"/>
             <w:r>
               <w:rPr>
                 <w:rFonts w:ascii="Arial" w:eastAsia="Times New Roman" w:hAnsi="Arial" w:cs="Arial"/>
@@ -978,27 +832,7 @@
                 <w:szCs w:val="20"/>
                 <w:lang w:eastAsia="es-ES"/>
               </w:rPr>
-              <w:t>entidad</w:t>
-            </w:r>
-            <w:proofErr w:type="gramEnd"/>
-            <w:r>
-              <w:rPr>
-                <w:rFonts w:ascii="Arial" w:eastAsia="Times New Roman" w:hAnsi="Arial" w:cs="Arial"/>
-                <w:sz w:val="20"/>
-                <w:szCs w:val="20"/>
-                <w:lang w:eastAsia="es-ES"/>
-              </w:rPr>
-              <w:t>_rama</w:t>
-            </w:r>
-            <w:proofErr w:type="spellEnd"/>
-            <w:r>
-              <w:rPr>
-                <w:rFonts w:ascii="Arial" w:eastAsia="Times New Roman" w:hAnsi="Arial" w:cs="Arial"/>
-                <w:sz w:val="20"/>
-                <w:szCs w:val="20"/>
-                <w:lang w:eastAsia="es-ES"/>
-              </w:rPr>
-              <w:t xml:space="preserve"> }}</w:t>
+              <w:t>_rama }}</w:t>
             </w:r>
           </w:p>
         </w:tc>
@@ -1083,31 +917,7 @@
           <w:u w:val="single"/>
           <w:lang w:eastAsia="es-ES"/>
         </w:rPr>
-        <w:t xml:space="preserve">{ </w:t>
-      </w:r>
-      <w:proofErr w:type="spellStart"/>
-      <w:r>
-        <w:rPr>
-          <w:rFonts w:ascii="Arial" w:eastAsia="Times New Roman" w:hAnsi="Arial" w:cs="Arial"/>
-          <w:bCs/>
-          <w:sz w:val="20"/>
-          <w:szCs w:val="20"/>
-          <w:u w:val="single"/>
-          <w:lang w:eastAsia="es-ES"/>
-        </w:rPr>
-        <w:t>trabajador_nombre</w:t>
-      </w:r>
-      <w:proofErr w:type="spellEnd"/>
-      <w:r>
-        <w:rPr>
-          <w:rFonts w:ascii="Arial" w:eastAsia="Times New Roman" w:hAnsi="Arial" w:cs="Arial"/>
-          <w:bCs/>
-          <w:sz w:val="20"/>
-          <w:szCs w:val="20"/>
-          <w:u w:val="single"/>
-          <w:lang w:eastAsia="es-ES"/>
-        </w:rPr>
-        <w:t xml:space="preserve"> }}  </w:t>
+        <w:t xml:space="preserve">{ trabajador_nombre }}  </w:t>
       </w:r>
       <w:r>
         <w:rPr>
@@ -1224,9 +1034,9 @@
                 <w:szCs w:val="20"/>
                 <w:lang w:eastAsia="es-ES"/>
               </w:rPr>
-              <w:t xml:space="preserve">{{ </w:t>
-            </w:r>
-            <w:proofErr w:type="spellStart"/>
+              <w:t>{{ trabajador</w:t>
+            </w:r>
+            <w:proofErr w:type="gramEnd"/>
             <w:r>
               <w:rPr>
                 <w:rFonts w:ascii="Arial" w:eastAsia="Times New Roman" w:hAnsi="Arial" w:cs="Arial"/>
@@ -1234,27 +1044,7 @@
                 <w:szCs w:val="20"/>
                 <w:lang w:eastAsia="es-ES"/>
               </w:rPr>
-              <w:t>trabajador</w:t>
-            </w:r>
-            <w:proofErr w:type="gramEnd"/>
-            <w:r>
-              <w:rPr>
-                <w:rFonts w:ascii="Arial" w:eastAsia="Times New Roman" w:hAnsi="Arial" w:cs="Arial"/>
-                <w:sz w:val="20"/>
-                <w:szCs w:val="20"/>
-                <w:lang w:eastAsia="es-ES"/>
-              </w:rPr>
-              <w:t>_ci</w:t>
-            </w:r>
-            <w:proofErr w:type="spellEnd"/>
-            <w:r>
-              <w:rPr>
-                <w:rFonts w:ascii="Arial" w:eastAsia="Times New Roman" w:hAnsi="Arial" w:cs="Arial"/>
-                <w:sz w:val="20"/>
-                <w:szCs w:val="20"/>
-                <w:lang w:eastAsia="es-ES"/>
-              </w:rPr>
-              <w:t xml:space="preserve"> }}</w:t>
+              <w:t>_ci }}</w:t>
             </w:r>
             <w:r>
               <w:rPr>
@@ -1312,9 +1102,9 @@
                 <w:szCs w:val="20"/>
                 <w:lang w:eastAsia="es-ES"/>
               </w:rPr>
-              <w:t xml:space="preserve">{{ </w:t>
-            </w:r>
-            <w:proofErr w:type="spellStart"/>
+              <w:t>{{ trabajador</w:t>
+            </w:r>
+            <w:proofErr w:type="gramEnd"/>
             <w:r>
               <w:rPr>
                 <w:rFonts w:ascii="Arial" w:eastAsia="Times New Roman" w:hAnsi="Arial" w:cs="Arial"/>
@@ -1322,27 +1112,7 @@
                 <w:szCs w:val="20"/>
                 <w:lang w:eastAsia="es-ES"/>
               </w:rPr>
-              <w:t>trabajador</w:t>
-            </w:r>
-            <w:proofErr w:type="gramEnd"/>
-            <w:r>
-              <w:rPr>
-                <w:rFonts w:ascii="Arial" w:eastAsia="Times New Roman" w:hAnsi="Arial" w:cs="Arial"/>
-                <w:sz w:val="20"/>
-                <w:szCs w:val="20"/>
-                <w:lang w:eastAsia="es-ES"/>
-              </w:rPr>
-              <w:t>_fecha_nacimiento</w:t>
-            </w:r>
-            <w:proofErr w:type="spellEnd"/>
-            <w:r>
-              <w:rPr>
-                <w:rFonts w:ascii="Arial" w:eastAsia="Times New Roman" w:hAnsi="Arial" w:cs="Arial"/>
-                <w:sz w:val="20"/>
-                <w:szCs w:val="20"/>
-                <w:lang w:eastAsia="es-ES"/>
-              </w:rPr>
-              <w:t xml:space="preserve"> }}</w:t>
+              <w:t>_fecha_nacimiento }}</w:t>
             </w:r>
           </w:p>
         </w:tc>
@@ -1390,9 +1160,9 @@
                 <w:szCs w:val="20"/>
                 <w:lang w:eastAsia="es-ES"/>
               </w:rPr>
-              <w:t xml:space="preserve">{{ </w:t>
-            </w:r>
-            <w:proofErr w:type="spellStart"/>
+              <w:t>{{ trabajador</w:t>
+            </w:r>
+            <w:proofErr w:type="gramEnd"/>
             <w:r>
               <w:rPr>
                 <w:rFonts w:ascii="Arial" w:eastAsia="Times New Roman" w:hAnsi="Arial" w:cs="Arial"/>
@@ -1400,27 +1170,7 @@
                 <w:szCs w:val="20"/>
                 <w:lang w:eastAsia="es-ES"/>
               </w:rPr>
-              <w:t>trabajador</w:t>
-            </w:r>
-            <w:proofErr w:type="gramEnd"/>
-            <w:r>
-              <w:rPr>
-                <w:rFonts w:ascii="Arial" w:eastAsia="Times New Roman" w:hAnsi="Arial" w:cs="Arial"/>
-                <w:sz w:val="20"/>
-                <w:szCs w:val="20"/>
-                <w:lang w:eastAsia="es-ES"/>
-              </w:rPr>
-              <w:t>_profesion</w:t>
-            </w:r>
-            <w:proofErr w:type="spellEnd"/>
-            <w:r>
-              <w:rPr>
-                <w:rFonts w:ascii="Arial" w:eastAsia="Times New Roman" w:hAnsi="Arial" w:cs="Arial"/>
-                <w:sz w:val="20"/>
-                <w:szCs w:val="20"/>
-                <w:lang w:eastAsia="es-ES"/>
-              </w:rPr>
-              <w:t xml:space="preserve"> }}</w:t>
+              <w:t>_profesion }}</w:t>
             </w:r>
           </w:p>
           <w:p>
@@ -1480,9 +1230,9 @@
                 <w:szCs w:val="20"/>
                 <w:lang w:eastAsia="es-ES"/>
               </w:rPr>
-              <w:t xml:space="preserve">{{ </w:t>
-            </w:r>
-            <w:proofErr w:type="spellStart"/>
+              <w:t>{{ trabajador</w:t>
+            </w:r>
+            <w:proofErr w:type="gramEnd"/>
             <w:r>
               <w:rPr>
                 <w:rFonts w:ascii="Arial" w:eastAsia="Times New Roman" w:hAnsi="Arial" w:cs="Arial"/>
@@ -1490,27 +1240,7 @@
                 <w:szCs w:val="20"/>
                 <w:lang w:eastAsia="es-ES"/>
               </w:rPr>
-              <w:t>trabajador</w:t>
-            </w:r>
-            <w:proofErr w:type="gramEnd"/>
-            <w:r>
-              <w:rPr>
-                <w:rFonts w:ascii="Arial" w:eastAsia="Times New Roman" w:hAnsi="Arial" w:cs="Arial"/>
-                <w:sz w:val="20"/>
-                <w:szCs w:val="20"/>
-                <w:lang w:eastAsia="es-ES"/>
-              </w:rPr>
-              <w:t>_direccion</w:t>
-            </w:r>
-            <w:proofErr w:type="spellEnd"/>
-            <w:r>
-              <w:rPr>
-                <w:rFonts w:ascii="Arial" w:eastAsia="Times New Roman" w:hAnsi="Arial" w:cs="Arial"/>
-                <w:sz w:val="20"/>
-                <w:szCs w:val="20"/>
-                <w:lang w:eastAsia="es-ES"/>
-              </w:rPr>
-              <w:t xml:space="preserve"> }}</w:t>
+              <w:t>_direccion }}</w:t>
             </w:r>
           </w:p>
         </w:tc>
@@ -1561,9 +1291,9 @@
                 <w:szCs w:val="20"/>
                 <w:lang w:eastAsia="es-ES"/>
               </w:rPr>
-              <w:t xml:space="preserve">{{ </w:t>
-            </w:r>
-            <w:proofErr w:type="spellStart"/>
+              <w:t>{{ trabajador</w:t>
+            </w:r>
+            <w:proofErr w:type="gramEnd"/>
             <w:r>
               <w:rPr>
                 <w:rFonts w:ascii="Arial" w:eastAsia="Times New Roman" w:hAnsi="Arial" w:cs="Arial"/>
@@ -1571,27 +1301,7 @@
                 <w:szCs w:val="20"/>
                 <w:lang w:eastAsia="es-ES"/>
               </w:rPr>
-              <w:t>trabajador</w:t>
-            </w:r>
-            <w:proofErr w:type="gramEnd"/>
-            <w:r>
-              <w:rPr>
-                <w:rFonts w:ascii="Arial" w:eastAsia="Times New Roman" w:hAnsi="Arial" w:cs="Arial"/>
-                <w:sz w:val="20"/>
-                <w:szCs w:val="20"/>
-                <w:lang w:eastAsia="es-ES"/>
-              </w:rPr>
-              <w:t>_provincia</w:t>
-            </w:r>
-            <w:proofErr w:type="spellEnd"/>
-            <w:r>
-              <w:rPr>
-                <w:rFonts w:ascii="Arial" w:eastAsia="Times New Roman" w:hAnsi="Arial" w:cs="Arial"/>
-                <w:sz w:val="20"/>
-                <w:szCs w:val="20"/>
-                <w:lang w:eastAsia="es-ES"/>
-              </w:rPr>
-              <w:t xml:space="preserve"> }}</w:t>
+              <w:t>_provincia }}</w:t>
             </w:r>
           </w:p>
         </w:tc>
@@ -1637,9 +1347,9 @@
                 <w:szCs w:val="20"/>
                 <w:lang w:eastAsia="es-ES"/>
               </w:rPr>
-              <w:t xml:space="preserve">{{ </w:t>
-            </w:r>
-            <w:proofErr w:type="spellStart"/>
+              <w:t>{{ trabajador</w:t>
+            </w:r>
+            <w:proofErr w:type="gramEnd"/>
             <w:r>
               <w:rPr>
                 <w:rFonts w:ascii="Arial" w:eastAsia="Times New Roman" w:hAnsi="Arial" w:cs="Arial"/>
@@ -1647,27 +1357,7 @@
                 <w:szCs w:val="20"/>
                 <w:lang w:eastAsia="es-ES"/>
               </w:rPr>
-              <w:t>trabajador</w:t>
-            </w:r>
-            <w:proofErr w:type="gramEnd"/>
-            <w:r>
-              <w:rPr>
-                <w:rFonts w:ascii="Arial" w:eastAsia="Times New Roman" w:hAnsi="Arial" w:cs="Arial"/>
-                <w:sz w:val="20"/>
-                <w:szCs w:val="20"/>
-                <w:lang w:eastAsia="es-ES"/>
-              </w:rPr>
-              <w:t>_municipio</w:t>
-            </w:r>
-            <w:proofErr w:type="spellEnd"/>
-            <w:r>
-              <w:rPr>
-                <w:rFonts w:ascii="Arial" w:eastAsia="Times New Roman" w:hAnsi="Arial" w:cs="Arial"/>
-                <w:sz w:val="20"/>
-                <w:szCs w:val="20"/>
-                <w:lang w:eastAsia="es-ES"/>
-              </w:rPr>
-              <w:t xml:space="preserve"> }}</w:t>
+              <w:t>_municipio }}</w:t>
             </w:r>
           </w:p>
         </w:tc>
@@ -1817,18 +1507,7 @@
           <w:u w:val="single"/>
           <w:lang w:eastAsia="es-ES"/>
         </w:rPr>
-        <w:t xml:space="preserve">{{ </w:t>
-      </w:r>
-      <w:proofErr w:type="spellStart"/>
-      <w:r>
-        <w:rPr>
-          <w:rFonts w:ascii="Arial" w:eastAsia="Times New Roman" w:hAnsi="Arial" w:cs="Arial"/>
-          <w:sz w:val="20"/>
-          <w:szCs w:val="20"/>
-          <w:u w:val="single"/>
-          <w:lang w:eastAsia="es-ES"/>
-        </w:rPr>
-        <w:t>check</w:t>
+        <w:t>{{ check</w:t>
       </w:r>
       <w:proofErr w:type="gramEnd"/>
       <w:r>
@@ -1839,18 +1518,7 @@
           <w:u w:val="single"/>
           <w:lang w:eastAsia="es-ES"/>
         </w:rPr>
-        <w:t>_indeterminado</w:t>
-      </w:r>
-      <w:proofErr w:type="spellEnd"/>
-      <w:r>
-        <w:rPr>
-          <w:rFonts w:ascii="Arial" w:eastAsia="Times New Roman" w:hAnsi="Arial" w:cs="Arial"/>
-          <w:sz w:val="20"/>
-          <w:szCs w:val="20"/>
-          <w:u w:val="single"/>
-          <w:lang w:eastAsia="es-ES"/>
-        </w:rPr>
-        <w:t xml:space="preserve"> }}</w:t>
+        <w:t>_indeterminado }}</w:t>
       </w:r>
       <w:r>
         <w:rPr>
@@ -1882,18 +1550,7 @@
           <w:u w:val="single"/>
           <w:lang w:eastAsia="es-ES"/>
         </w:rPr>
-        <w:t xml:space="preserve">{{ </w:t>
-      </w:r>
-      <w:proofErr w:type="spellStart"/>
-      <w:r>
-        <w:rPr>
-          <w:rFonts w:ascii="Arial" w:eastAsia="Times New Roman" w:hAnsi="Arial" w:cs="Arial"/>
-          <w:sz w:val="20"/>
-          <w:szCs w:val="20"/>
-          <w:u w:val="single"/>
-          <w:lang w:eastAsia="es-ES"/>
-        </w:rPr>
-        <w:t>check</w:t>
+        <w:t>{{ check</w:t>
       </w:r>
       <w:proofErr w:type="gramEnd"/>
       <w:r>
@@ -1904,18 +1561,7 @@
           <w:u w:val="single"/>
           <w:lang w:eastAsia="es-ES"/>
         </w:rPr>
-        <w:t>_determinado</w:t>
-      </w:r>
-      <w:proofErr w:type="spellEnd"/>
-      <w:r>
-        <w:rPr>
-          <w:rFonts w:ascii="Arial" w:eastAsia="Times New Roman" w:hAnsi="Arial" w:cs="Arial"/>
-          <w:sz w:val="20"/>
-          <w:szCs w:val="20"/>
-          <w:u w:val="single"/>
-          <w:lang w:eastAsia="es-ES"/>
-        </w:rPr>
-        <w:t xml:space="preserve"> }}</w:t>
+        <w:t>_determinado }}</w:t>
       </w:r>
       <w:r>
         <w:rPr>
@@ -1986,29 +1632,7 @@
           <w:u w:val="single"/>
           <w:lang w:eastAsia="es-ES"/>
         </w:rPr>
-        <w:t xml:space="preserve">{ </w:t>
-      </w:r>
-      <w:proofErr w:type="spellStart"/>
-      <w:r>
-        <w:rPr>
-          <w:rFonts w:ascii="Arial" w:eastAsia="Times New Roman" w:hAnsi="Arial" w:cs="Arial"/>
-          <w:sz w:val="20"/>
-          <w:szCs w:val="20"/>
-          <w:u w:val="single"/>
-          <w:lang w:eastAsia="es-ES"/>
-        </w:rPr>
-        <w:t>contrato_duracion</w:t>
-      </w:r>
-      <w:proofErr w:type="spellEnd"/>
-      <w:r>
-        <w:rPr>
-          <w:rFonts w:ascii="Arial" w:eastAsia="Times New Roman" w:hAnsi="Arial" w:cs="Arial"/>
-          <w:sz w:val="20"/>
-          <w:szCs w:val="20"/>
-          <w:u w:val="single"/>
-          <w:lang w:eastAsia="es-ES"/>
-        </w:rPr>
-        <w:t xml:space="preserve"> }}  </w:t>
+        <w:t xml:space="preserve">{ contrato_duracion }}  </w:t>
       </w:r>
       <w:r>
         <w:rPr>
@@ -2079,29 +1703,7 @@
           <w:u w:val="single"/>
           <w:lang w:eastAsia="es-ES"/>
         </w:rPr>
-        <w:t xml:space="preserve">{ </w:t>
-      </w:r>
-      <w:proofErr w:type="spellStart"/>
-      <w:r>
-        <w:rPr>
-          <w:rFonts w:ascii="Arial" w:eastAsia="Times New Roman" w:hAnsi="Arial" w:cs="Arial"/>
-          <w:sz w:val="20"/>
-          <w:szCs w:val="20"/>
-          <w:u w:val="single"/>
-          <w:lang w:eastAsia="es-ES"/>
-        </w:rPr>
-        <w:t>contrato_motivo</w:t>
-      </w:r>
-      <w:proofErr w:type="spellEnd"/>
-      <w:r>
-        <w:rPr>
-          <w:rFonts w:ascii="Arial" w:eastAsia="Times New Roman" w:hAnsi="Arial" w:cs="Arial"/>
-          <w:sz w:val="20"/>
-          <w:szCs w:val="20"/>
-          <w:u w:val="single"/>
-          <w:lang w:eastAsia="es-ES"/>
-        </w:rPr>
-        <w:t xml:space="preserve"> }}   </w:t>
+        <w:t xml:space="preserve">{ contrato_motivo }}   </w:t>
       </w:r>
     </w:p>
     <w:p>
@@ -2234,29 +1836,7 @@
           <w:u w:val="single"/>
           <w:lang w:eastAsia="es-ES"/>
         </w:rPr>
-        <w:t xml:space="preserve">{ </w:t>
-      </w:r>
-      <w:proofErr w:type="spellStart"/>
-      <w:r>
-        <w:rPr>
-          <w:rFonts w:ascii="Arial" w:eastAsia="Times New Roman" w:hAnsi="Arial" w:cs="Arial"/>
-          <w:sz w:val="20"/>
-          <w:szCs w:val="20"/>
-          <w:u w:val="single"/>
-          <w:lang w:eastAsia="es-ES"/>
-        </w:rPr>
-        <w:t>cargo_nombre</w:t>
-      </w:r>
-      <w:proofErr w:type="spellEnd"/>
-      <w:r>
-        <w:rPr>
-          <w:rFonts w:ascii="Arial" w:eastAsia="Times New Roman" w:hAnsi="Arial" w:cs="Arial"/>
-          <w:sz w:val="20"/>
-          <w:szCs w:val="20"/>
-          <w:u w:val="single"/>
-          <w:lang w:eastAsia="es-ES"/>
-        </w:rPr>
-        <w:t xml:space="preserve"> }}  </w:t>
+        <w:t xml:space="preserve">{ cargo_nombre }}  </w:t>
       </w:r>
       <w:r>
         <w:rPr>
@@ -2303,29 +1883,7 @@
           <w:u w:val="single"/>
           <w:lang w:eastAsia="es-ES"/>
         </w:rPr>
-        <w:t xml:space="preserve">{{ </w:t>
-      </w:r>
-      <w:proofErr w:type="spellStart"/>
-      <w:r>
-        <w:rPr>
-          <w:rFonts w:ascii="Arial" w:eastAsia="Times New Roman" w:hAnsi="Arial" w:cs="Arial"/>
-          <w:sz w:val="20"/>
-          <w:szCs w:val="20"/>
-          <w:u w:val="single"/>
-          <w:lang w:eastAsia="es-ES"/>
-        </w:rPr>
-        <w:t>cargo_grupo</w:t>
-      </w:r>
-      <w:proofErr w:type="spellEnd"/>
-      <w:r>
-        <w:rPr>
-          <w:rFonts w:ascii="Arial" w:eastAsia="Times New Roman" w:hAnsi="Arial" w:cs="Arial"/>
-          <w:sz w:val="20"/>
-          <w:szCs w:val="20"/>
-          <w:u w:val="single"/>
-          <w:lang w:eastAsia="es-ES"/>
-        </w:rPr>
-        <w:t xml:space="preserve"> }}  </w:t>
+        <w:t xml:space="preserve">{{ cargo_grupo }}  </w:t>
       </w:r>
       <w:r>
         <w:rPr>
@@ -2343,27 +1901,7 @@
           <w:szCs w:val="20"/>
           <w:lang w:eastAsia="es-ES"/>
         </w:rPr>
-        <w:t xml:space="preserve">{{ </w:t>
-      </w:r>
-      <w:proofErr w:type="spellStart"/>
-      <w:r>
-        <w:rPr>
-          <w:rFonts w:ascii="Arial" w:eastAsia="Times New Roman" w:hAnsi="Arial" w:cs="Arial"/>
-          <w:sz w:val="20"/>
-          <w:szCs w:val="20"/>
-          <w:lang w:eastAsia="es-ES"/>
-        </w:rPr>
-        <w:t>bg_obr</w:t>
-      </w:r>
-      <w:proofErr w:type="spellEnd"/>
-      <w:r>
-        <w:rPr>
-          <w:rFonts w:ascii="Arial" w:eastAsia="Times New Roman" w:hAnsi="Arial" w:cs="Arial"/>
-          <w:sz w:val="20"/>
-          <w:szCs w:val="20"/>
-          <w:lang w:eastAsia="es-ES"/>
-        </w:rPr>
-        <w:t xml:space="preserve"> }}</w:t>
+        <w:t>{{ bg_obr }}</w:t>
       </w:r>
       <w:r>
         <w:rPr>
@@ -2381,27 +1919,7 @@
           <w:szCs w:val="20"/>
           <w:lang w:eastAsia="es-ES"/>
         </w:rPr>
-        <w:t xml:space="preserve">{{ </w:t>
-      </w:r>
-      <w:proofErr w:type="spellStart"/>
-      <w:r>
-        <w:rPr>
-          <w:rFonts w:ascii="Arial" w:eastAsia="Times New Roman" w:hAnsi="Arial" w:cs="Arial"/>
-          <w:sz w:val="20"/>
-          <w:szCs w:val="20"/>
-          <w:lang w:eastAsia="es-ES"/>
-        </w:rPr>
-        <w:t>bg_adm</w:t>
-      </w:r>
-      <w:proofErr w:type="spellEnd"/>
-      <w:r>
-        <w:rPr>
-          <w:rFonts w:ascii="Arial" w:eastAsia="Times New Roman" w:hAnsi="Arial" w:cs="Arial"/>
-          <w:sz w:val="20"/>
-          <w:szCs w:val="20"/>
-          <w:lang w:eastAsia="es-ES"/>
-        </w:rPr>
-        <w:t xml:space="preserve"> }}</w:t>
+        <w:t>{{ bg_adm }}</w:t>
       </w:r>
       <w:r>
         <w:rPr>
@@ -2419,27 +1937,7 @@
           <w:szCs w:val="20"/>
           <w:lang w:eastAsia="es-ES"/>
         </w:rPr>
-        <w:t xml:space="preserve">{{ </w:t>
-      </w:r>
-      <w:proofErr w:type="spellStart"/>
-      <w:r>
-        <w:rPr>
-          <w:rFonts w:ascii="Arial" w:eastAsia="Times New Roman" w:hAnsi="Arial" w:cs="Arial"/>
-          <w:sz w:val="20"/>
-          <w:szCs w:val="20"/>
-          <w:lang w:eastAsia="es-ES"/>
-        </w:rPr>
-        <w:t>bg_ser</w:t>
-      </w:r>
-      <w:proofErr w:type="spellEnd"/>
-      <w:r>
-        <w:rPr>
-          <w:rFonts w:ascii="Arial" w:eastAsia="Times New Roman" w:hAnsi="Arial" w:cs="Arial"/>
-          <w:sz w:val="20"/>
-          <w:szCs w:val="20"/>
-          <w:lang w:eastAsia="es-ES"/>
-        </w:rPr>
-        <w:t xml:space="preserve"> }}</w:t>
+        <w:t>{{ bg_ser }}</w:t>
       </w:r>
       <w:r>
         <w:rPr>
@@ -2457,36 +1955,70 @@
           <w:szCs w:val="20"/>
           <w:lang w:eastAsia="es-ES"/>
         </w:rPr>
-        <w:t xml:space="preserve">{{ </w:t>
-      </w:r>
-      <w:proofErr w:type="spellStart"/>
-      <w:r>
-        <w:rPr>
-          <w:rFonts w:ascii="Arial" w:eastAsia="Times New Roman" w:hAnsi="Arial" w:cs="Arial"/>
-          <w:sz w:val="20"/>
-          <w:szCs w:val="20"/>
-          <w:lang w:eastAsia="es-ES"/>
-        </w:rPr>
-        <w:t>bg_tec</w:t>
-      </w:r>
-      <w:proofErr w:type="spellEnd"/>
-      <w:r>
-        <w:rPr>
-          <w:rFonts w:ascii="Arial" w:eastAsia="Times New Roman" w:hAnsi="Arial" w:cs="Arial"/>
-          <w:sz w:val="20"/>
-          <w:szCs w:val="20"/>
-          <w:lang w:eastAsia="es-ES"/>
-        </w:rPr>
-        <w:t xml:space="preserve"> }}</w:t>
-      </w:r>
-      <w:r>
-        <w:rPr>
-          <w:rFonts w:ascii="Arial" w:eastAsia="Times New Roman" w:hAnsi="Arial" w:cs="Arial"/>
-          <w:sz w:val="20"/>
-          <w:szCs w:val="20"/>
-          <w:lang w:val="es-ES_tradnl" w:eastAsia="es-ES"/>
-        </w:rPr>
-        <w:t xml:space="preserve"> ),  cuyo contenido de trabajo se anexa al presente contrato y es de obligatorio cumplimiento, así como aquellas tareas o actividades que le sean asignadas por su jefe inmediato superior.</w:t>
+        <w:t>{{ bg_tec }}</w:t>
+      </w:r>
+      <w:r>
+        <w:rPr>
+          <w:rFonts w:ascii="Arial" w:eastAsia="Times New Roman" w:hAnsi="Arial" w:cs="Arial"/>
+          <w:sz w:val="20"/>
+          <w:szCs w:val="20"/>
+          <w:lang w:val="es-ES_tradnl" w:eastAsia="es-ES"/>
+        </w:rPr>
+        <w:t xml:space="preserve"> )</w:t>
+      </w:r>
+      <w:r>
+        <w:rPr>
+          <w:rFonts w:ascii="Arial" w:eastAsia="Times New Roman" w:hAnsi="Arial" w:cs="Arial"/>
+          <w:sz w:val="20"/>
+          <w:szCs w:val="20"/>
+          <w:lang w:val="es-ES_tradnl" w:eastAsia="es-ES"/>
+        </w:rPr>
+        <w:t xml:space="preserve"> Cuadro </w:t>
+      </w:r>
+      <w:r>
+        <w:rPr>
+          <w:rFonts w:ascii="Arial" w:eastAsia="Times New Roman" w:hAnsi="Arial" w:cs="Arial"/>
+          <w:sz w:val="20"/>
+          <w:szCs w:val="20"/>
+          <w:lang w:val="es-ES_tradnl" w:eastAsia="es-ES"/>
+        </w:rPr>
+        <w:t xml:space="preserve">( </w:t>
+      </w:r>
+      <w:r>
+        <w:rPr>
+          <w:rFonts w:ascii="Arial" w:eastAsia="Times New Roman" w:hAnsi="Arial" w:cs="Arial"/>
+          <w:sz w:val="20"/>
+          <w:szCs w:val="20"/>
+          <w:lang w:eastAsia="es-ES"/>
+        </w:rPr>
+        <w:t>{{ bg_cdi }}</w:t>
+      </w:r>
+      <w:r>
+        <w:rPr>
+          <w:rFonts w:ascii="Arial" w:eastAsia="Times New Roman" w:hAnsi="Arial" w:cs="Arial"/>
+          <w:sz w:val="20"/>
+          <w:szCs w:val="20"/>
+          <w:lang w:val="es-ES_tradnl" w:eastAsia="es-ES"/>
+        </w:rPr>
+        <w:t xml:space="preserve"> </w:t>
+      </w:r>
+      <w:r>
+        <w:rPr>
+          <w:rFonts w:ascii="Arial" w:eastAsia="Times New Roman" w:hAnsi="Arial" w:cs="Arial"/>
+          <w:sz w:val="20"/>
+          <w:szCs w:val="20"/>
+          <w:lang w:val="es-ES_tradnl" w:eastAsia="es-ES"/>
+        </w:rPr>
+        <w:t>)</w:t>
+      </w:r>
+      <w:r>
+        <w:rPr>
+          <w:rFonts w:ascii="Arial" w:eastAsia="Times New Roman" w:hAnsi="Arial" w:cs="Arial"/>
+          <w:sz w:val="20"/>
+          <w:szCs w:val="20"/>
+          <w:lang w:val="es-ES_tradnl" w:eastAsia="es-ES"/>
+        </w:rPr>
+        <w:t>,  cuyo contenido de trabajo se anexa al presente contrato y es de obligatorio cumplimiento, así como aquellas tareas o actividades que le sean asignadas por su jefe inmediato superior.</w:t>
       </w:r>
     </w:p>
     <w:p>
@@ -2548,29 +2080,7 @@
           <w:u w:val="single"/>
           <w:lang w:eastAsia="es-ES"/>
         </w:rPr>
-        <w:t xml:space="preserve">{ </w:t>
-      </w:r>
-      <w:proofErr w:type="spellStart"/>
-      <w:r>
-        <w:rPr>
-          <w:rFonts w:ascii="Arial" w:eastAsia="Times New Roman" w:hAnsi="Arial" w:cs="Arial"/>
-          <w:sz w:val="20"/>
-          <w:szCs w:val="20"/>
-          <w:u w:val="single"/>
-          <w:lang w:eastAsia="es-ES"/>
-        </w:rPr>
-        <w:t>contrato_jornada</w:t>
-      </w:r>
-      <w:proofErr w:type="spellEnd"/>
-      <w:r>
-        <w:rPr>
-          <w:rFonts w:ascii="Arial" w:eastAsia="Times New Roman" w:hAnsi="Arial" w:cs="Arial"/>
-          <w:sz w:val="20"/>
-          <w:szCs w:val="20"/>
-          <w:u w:val="single"/>
-          <w:lang w:eastAsia="es-ES"/>
-        </w:rPr>
-        <w:t xml:space="preserve"> }} </w:t>
+        <w:t xml:space="preserve">{ contrato_jornada }} </w:t>
       </w:r>
       <w:r>
         <w:rPr>
@@ -2635,29 +2145,7 @@
           <w:u w:val="single"/>
           <w:lang w:eastAsia="es-ES"/>
         </w:rPr>
-        <w:t xml:space="preserve">{{ </w:t>
-      </w:r>
-      <w:proofErr w:type="spellStart"/>
-      <w:r>
-        <w:rPr>
-          <w:rFonts w:ascii="Arial" w:eastAsia="Times New Roman" w:hAnsi="Arial" w:cs="Arial"/>
-          <w:sz w:val="20"/>
-          <w:szCs w:val="20"/>
-          <w:u w:val="single"/>
-          <w:lang w:eastAsia="es-ES"/>
-        </w:rPr>
-        <w:t>contrato_horario</w:t>
-      </w:r>
-      <w:proofErr w:type="spellEnd"/>
-      <w:r>
-        <w:rPr>
-          <w:rFonts w:ascii="Arial" w:eastAsia="Times New Roman" w:hAnsi="Arial" w:cs="Arial"/>
-          <w:sz w:val="20"/>
-          <w:szCs w:val="20"/>
-          <w:u w:val="single"/>
-          <w:lang w:eastAsia="es-ES"/>
-        </w:rPr>
-        <w:t xml:space="preserve"> }}  </w:t>
+        <w:t xml:space="preserve">{{ contrato_horario }}  </w:t>
       </w:r>
       <w:r>
         <w:rPr>
@@ -2957,9 +2445,8 @@
           <w:szCs w:val="20"/>
           <w:lang w:val="en-US" w:eastAsia="es-ES"/>
         </w:rPr>
-        <w:t xml:space="preserve">{ </w:t>
-      </w:r>
-      <w:proofErr w:type="spellStart"/>
+        <w:t>{ check_fundamental }}</w:t>
+      </w:r>
       <w:r>
         <w:rPr>
           <w:rFonts w:ascii="Arial" w:eastAsia="Times New Roman" w:hAnsi="Arial" w:cs="Arial"/>
@@ -2967,46 +2454,7 @@
           <w:szCs w:val="20"/>
           <w:lang w:val="en-US" w:eastAsia="es-ES"/>
         </w:rPr>
-        <w:t>check_fundamental</w:t>
-      </w:r>
-      <w:proofErr w:type="spellEnd"/>
-      <w:r>
-        <w:rPr>
-          <w:rFonts w:ascii="Arial" w:eastAsia="Times New Roman" w:hAnsi="Arial" w:cs="Arial"/>
-          <w:sz w:val="20"/>
-          <w:szCs w:val="20"/>
-          <w:lang w:val="en-US" w:eastAsia="es-ES"/>
-        </w:rPr>
-        <w:t xml:space="preserve"> }}</w:t>
-      </w:r>
-      <w:r>
-        <w:rPr>
-          <w:rFonts w:ascii="Arial" w:eastAsia="Times New Roman" w:hAnsi="Arial" w:cs="Arial"/>
-          <w:sz w:val="20"/>
-          <w:szCs w:val="20"/>
-          <w:lang w:val="en-US" w:eastAsia="es-ES"/>
-        </w:rPr>
-        <w:t xml:space="preserve">)                                                 </w:t>
-      </w:r>
-      <w:proofErr w:type="spellStart"/>
-      <w:r>
-        <w:rPr>
-          <w:rFonts w:ascii="Arial" w:eastAsia="Times New Roman" w:hAnsi="Arial" w:cs="Arial"/>
-          <w:sz w:val="20"/>
-          <w:szCs w:val="20"/>
-          <w:lang w:val="en-US" w:eastAsia="es-ES"/>
-        </w:rPr>
-        <w:t>Tridente</w:t>
-      </w:r>
-      <w:proofErr w:type="spellEnd"/>
-      <w:r>
-        <w:rPr>
-          <w:rFonts w:ascii="Arial" w:eastAsia="Times New Roman" w:hAnsi="Arial" w:cs="Arial"/>
-          <w:sz w:val="20"/>
-          <w:szCs w:val="20"/>
-          <w:lang w:val="en-US" w:eastAsia="es-ES"/>
-        </w:rPr>
-        <w:t xml:space="preserve"> 2 (</w:t>
+        <w:t>)                                                 Tridente 2 (</w:t>
       </w:r>
       <w:r>
         <w:rPr>
@@ -3064,9 +2512,9 @@
           <w:szCs w:val="20"/>
           <w:lang w:val="en-US" w:eastAsia="es-ES"/>
         </w:rPr>
-        <w:t xml:space="preserve"> </w:t>
-      </w:r>
-      <w:proofErr w:type="spellStart"/>
+        <w:t xml:space="preserve"> Decisorio </w:t>
+      </w:r>
+      <w:proofErr w:type="gramStart"/>
       <w:r>
         <w:rPr>
           <w:rFonts w:ascii="Arial" w:eastAsia="Times New Roman" w:hAnsi="Arial" w:cs="Arial"/>
@@ -3074,9 +2522,8 @@
           <w:szCs w:val="20"/>
           <w:lang w:val="en-US" w:eastAsia="es-ES"/>
         </w:rPr>
-        <w:t>Decisorio</w:t>
-      </w:r>
-      <w:proofErr w:type="spellEnd"/>
+        <w:t>(</w:t>
+      </w:r>
       <w:r>
         <w:rPr>
           <w:rFonts w:ascii="Arial" w:eastAsia="Times New Roman" w:hAnsi="Arial" w:cs="Arial"/>
@@ -3084,9 +2531,9 @@
           <w:szCs w:val="20"/>
           <w:lang w:val="en-US" w:eastAsia="es-ES"/>
         </w:rPr>
-        <w:t xml:space="preserve"> </w:t>
-      </w:r>
-      <w:proofErr w:type="gramStart"/>
+        <w:t xml:space="preserve"> {</w:t>
+      </w:r>
+      <w:proofErr w:type="gramEnd"/>
       <w:r>
         <w:rPr>
           <w:rFonts w:ascii="Arial" w:eastAsia="Times New Roman" w:hAnsi="Arial" w:cs="Arial"/>
@@ -3094,7 +2541,7 @@
           <w:szCs w:val="20"/>
           <w:lang w:val="en-US" w:eastAsia="es-ES"/>
         </w:rPr>
-        <w:t>(</w:t>
+        <w:t>{ check_decisorio }}</w:t>
       </w:r>
       <w:r>
         <w:rPr>
@@ -3103,66 +2550,7 @@
           <w:szCs w:val="20"/>
           <w:lang w:val="en-US" w:eastAsia="es-ES"/>
         </w:rPr>
-        <w:t xml:space="preserve"> {</w:t>
-      </w:r>
-      <w:proofErr w:type="gramEnd"/>
-      <w:r>
-        <w:rPr>
-          <w:rFonts w:ascii="Arial" w:eastAsia="Times New Roman" w:hAnsi="Arial" w:cs="Arial"/>
-          <w:sz w:val="20"/>
-          <w:szCs w:val="20"/>
-          <w:lang w:val="en-US" w:eastAsia="es-ES"/>
-        </w:rPr>
-        <w:t xml:space="preserve">{ </w:t>
-      </w:r>
-      <w:proofErr w:type="spellStart"/>
-      <w:r>
-        <w:rPr>
-          <w:rFonts w:ascii="Arial" w:eastAsia="Times New Roman" w:hAnsi="Arial" w:cs="Arial"/>
-          <w:sz w:val="20"/>
-          <w:szCs w:val="20"/>
-          <w:lang w:val="en-US" w:eastAsia="es-ES"/>
-        </w:rPr>
-        <w:t>check_decisorio</w:t>
-      </w:r>
-      <w:proofErr w:type="spellEnd"/>
-      <w:r>
-        <w:rPr>
-          <w:rFonts w:ascii="Arial" w:eastAsia="Times New Roman" w:hAnsi="Arial" w:cs="Arial"/>
-          <w:sz w:val="20"/>
-          <w:szCs w:val="20"/>
-          <w:lang w:val="en-US" w:eastAsia="es-ES"/>
-        </w:rPr>
-        <w:t xml:space="preserve"> }}</w:t>
-      </w:r>
-      <w:r>
-        <w:rPr>
-          <w:rFonts w:ascii="Arial" w:eastAsia="Times New Roman" w:hAnsi="Arial" w:cs="Arial"/>
-          <w:sz w:val="20"/>
-          <w:szCs w:val="20"/>
-          <w:lang w:val="en-US" w:eastAsia="es-ES"/>
-        </w:rPr>
-        <w:t xml:space="preserve">)                                                       </w:t>
-      </w:r>
-      <w:proofErr w:type="spellStart"/>
-      <w:r>
-        <w:rPr>
-          <w:rFonts w:ascii="Arial" w:eastAsia="Times New Roman" w:hAnsi="Arial" w:cs="Arial"/>
-          <w:sz w:val="20"/>
-          <w:szCs w:val="20"/>
-          <w:lang w:val="en-US" w:eastAsia="es-ES"/>
-        </w:rPr>
-        <w:t>Tridente</w:t>
-      </w:r>
-      <w:proofErr w:type="spellEnd"/>
-      <w:r>
-        <w:rPr>
-          <w:rFonts w:ascii="Arial" w:eastAsia="Times New Roman" w:hAnsi="Arial" w:cs="Arial"/>
-          <w:sz w:val="20"/>
-          <w:szCs w:val="20"/>
-          <w:lang w:val="en-US" w:eastAsia="es-ES"/>
-        </w:rPr>
-        <w:t xml:space="preserve"> 3 (</w:t>
+        <w:t>)                                                       Tridente 3 (</w:t>
       </w:r>
       <w:r>
         <w:rPr>
@@ -3252,29 +2640,7 @@
           <w:u w:val="single"/>
           <w:lang w:eastAsia="es-ES"/>
         </w:rPr>
-        <w:t xml:space="preserve">{ </w:t>
-      </w:r>
-      <w:proofErr w:type="spellStart"/>
-      <w:r>
-        <w:rPr>
-          <w:rFonts w:ascii="Arial" w:eastAsia="Times New Roman" w:hAnsi="Arial" w:cs="Arial"/>
-          <w:sz w:val="20"/>
-          <w:szCs w:val="20"/>
-          <w:u w:val="single"/>
-          <w:lang w:eastAsia="es-ES"/>
-        </w:rPr>
-        <w:t>salario_resolucion</w:t>
-      </w:r>
-      <w:proofErr w:type="spellEnd"/>
-      <w:r>
-        <w:rPr>
-          <w:rFonts w:ascii="Arial" w:eastAsia="Times New Roman" w:hAnsi="Arial" w:cs="Arial"/>
-          <w:sz w:val="20"/>
-          <w:szCs w:val="20"/>
-          <w:u w:val="single"/>
-          <w:lang w:eastAsia="es-ES"/>
-        </w:rPr>
-        <w:t xml:space="preserve"> }}  </w:t>
+        <w:t xml:space="preserve">{ salario_resolucion }}  </w:t>
       </w:r>
       <w:r>
         <w:rPr>
@@ -3339,29 +2705,7 @@
           <w:u w:val="single"/>
           <w:lang w:eastAsia="es-ES"/>
         </w:rPr>
-        <w:t xml:space="preserve">{{ </w:t>
-      </w:r>
-      <w:proofErr w:type="spellStart"/>
-      <w:r>
-        <w:rPr>
-          <w:rFonts w:ascii="Arial" w:eastAsia="Times New Roman" w:hAnsi="Arial" w:cs="Arial"/>
-          <w:sz w:val="20"/>
-          <w:szCs w:val="20"/>
-          <w:u w:val="single"/>
-          <w:lang w:eastAsia="es-ES"/>
-        </w:rPr>
-        <w:t>tarifa_horaria</w:t>
-      </w:r>
-      <w:proofErr w:type="spellEnd"/>
-      <w:r>
-        <w:rPr>
-          <w:rFonts w:ascii="Arial" w:eastAsia="Times New Roman" w:hAnsi="Arial" w:cs="Arial"/>
-          <w:sz w:val="20"/>
-          <w:szCs w:val="20"/>
-          <w:u w:val="single"/>
-          <w:lang w:eastAsia="es-ES"/>
-        </w:rPr>
-        <w:t xml:space="preserve"> }}   </w:t>
+        <w:t xml:space="preserve">{{ tarifa_horaria }}   </w:t>
       </w:r>
       <w:r>
         <w:rPr>
@@ -3408,29 +2752,7 @@
           <w:u w:val="single"/>
           <w:lang w:eastAsia="es-ES"/>
         </w:rPr>
-        <w:t xml:space="preserve">{{ </w:t>
-      </w:r>
-      <w:proofErr w:type="spellStart"/>
-      <w:r>
-        <w:rPr>
-          <w:rFonts w:ascii="Arial" w:eastAsia="Times New Roman" w:hAnsi="Arial" w:cs="Arial"/>
-          <w:sz w:val="20"/>
-          <w:szCs w:val="20"/>
-          <w:u w:val="single"/>
-          <w:lang w:eastAsia="es-ES"/>
-        </w:rPr>
-        <w:t>salario_escala</w:t>
-      </w:r>
-      <w:proofErr w:type="spellEnd"/>
-      <w:r>
-        <w:rPr>
-          <w:rFonts w:ascii="Arial" w:eastAsia="Times New Roman" w:hAnsi="Arial" w:cs="Arial"/>
-          <w:sz w:val="20"/>
-          <w:szCs w:val="20"/>
-          <w:u w:val="single"/>
-          <w:lang w:eastAsia="es-ES"/>
-        </w:rPr>
-        <w:t xml:space="preserve"> }}  </w:t>
+        <w:t xml:space="preserve">{{ salario_escala }}  </w:t>
       </w:r>
       <w:r>
         <w:rPr>
@@ -3530,29 +2852,7 @@
           <w:u w:val="single"/>
           <w:lang w:eastAsia="es-ES"/>
         </w:rPr>
-        <w:t xml:space="preserve">{ </w:t>
-      </w:r>
-      <w:proofErr w:type="spellStart"/>
-      <w:r>
-        <w:rPr>
-          <w:rFonts w:ascii="Arial" w:eastAsia="Times New Roman" w:hAnsi="Arial" w:cs="Arial"/>
-          <w:sz w:val="20"/>
-          <w:szCs w:val="20"/>
-          <w:u w:val="single"/>
-          <w:lang w:eastAsia="es-ES"/>
-        </w:rPr>
-        <w:t>pago_cla</w:t>
-      </w:r>
-      <w:proofErr w:type="spellEnd"/>
-      <w:r>
-        <w:rPr>
-          <w:rFonts w:ascii="Arial" w:eastAsia="Times New Roman" w:hAnsi="Arial" w:cs="Arial"/>
-          <w:sz w:val="20"/>
-          <w:szCs w:val="20"/>
-          <w:u w:val="single"/>
-          <w:lang w:eastAsia="es-ES"/>
-        </w:rPr>
-        <w:t xml:space="preserve"> }}  </w:t>
+        <w:t xml:space="preserve">{ pago_cla }}  </w:t>
       </w:r>
       <w:r>
         <w:rPr>
@@ -3599,29 +2899,7 @@
           <w:u w:val="single"/>
           <w:lang w:eastAsia="es-ES"/>
         </w:rPr>
-        <w:t xml:space="preserve">{{ </w:t>
-      </w:r>
-      <w:proofErr w:type="spellStart"/>
-      <w:r>
-        <w:rPr>
-          <w:rFonts w:ascii="Arial" w:eastAsia="Times New Roman" w:hAnsi="Arial" w:cs="Arial"/>
-          <w:sz w:val="20"/>
-          <w:szCs w:val="20"/>
-          <w:u w:val="single"/>
-          <w:lang w:eastAsia="es-ES"/>
-        </w:rPr>
-        <w:t>pago_nocturnidad</w:t>
-      </w:r>
-      <w:proofErr w:type="spellEnd"/>
-      <w:r>
-        <w:rPr>
-          <w:rFonts w:ascii="Arial" w:eastAsia="Times New Roman" w:hAnsi="Arial" w:cs="Arial"/>
-          <w:sz w:val="20"/>
-          <w:szCs w:val="20"/>
-          <w:u w:val="single"/>
-          <w:lang w:eastAsia="es-ES"/>
-        </w:rPr>
-        <w:t xml:space="preserve"> }}  </w:t>
+        <w:t xml:space="preserve">{{ pago_nocturnidad }}  </w:t>
       </w:r>
       <w:r>
         <w:rPr>
@@ -3677,29 +2955,7 @@
           <w:u w:val="single"/>
           <w:lang w:eastAsia="es-ES"/>
         </w:rPr>
-        <w:t xml:space="preserve">{{ </w:t>
-      </w:r>
-      <w:proofErr w:type="spellStart"/>
-      <w:r>
-        <w:rPr>
-          <w:rFonts w:ascii="Arial" w:eastAsia="Times New Roman" w:hAnsi="Arial" w:cs="Arial"/>
-          <w:sz w:val="20"/>
-          <w:szCs w:val="20"/>
-          <w:u w:val="single"/>
-          <w:lang w:eastAsia="es-ES"/>
-        </w:rPr>
-        <w:t>pago_cnci</w:t>
-      </w:r>
-      <w:proofErr w:type="spellEnd"/>
-      <w:r>
-        <w:rPr>
-          <w:rFonts w:ascii="Arial" w:eastAsia="Times New Roman" w:hAnsi="Arial" w:cs="Arial"/>
-          <w:sz w:val="20"/>
-          <w:szCs w:val="20"/>
-          <w:u w:val="single"/>
-          <w:lang w:eastAsia="es-ES"/>
-        </w:rPr>
-        <w:t xml:space="preserve"> }}  </w:t>
+        <w:t xml:space="preserve">{{ pago_cnci }}  </w:t>
       </w:r>
       <w:r>
         <w:rPr>
@@ -3807,18 +3063,7 @@
           <w:u w:val="single"/>
           <w:lang w:eastAsia="es-ES"/>
         </w:rPr>
-        <w:t xml:space="preserve">{{ </w:t>
-      </w:r>
-      <w:proofErr w:type="spellStart"/>
-      <w:r>
-        <w:rPr>
-          <w:rFonts w:ascii="Arial" w:eastAsia="Times New Roman" w:hAnsi="Arial" w:cs="Arial"/>
-          <w:sz w:val="20"/>
-          <w:szCs w:val="20"/>
-          <w:u w:val="single"/>
-          <w:lang w:eastAsia="es-ES"/>
-        </w:rPr>
-        <w:t>check</w:t>
+        <w:t>{{ check</w:t>
       </w:r>
       <w:proofErr w:type="gramEnd"/>
       <w:r>
@@ -3829,18 +3074,7 @@
           <w:u w:val="single"/>
           <w:lang w:eastAsia="es-ES"/>
         </w:rPr>
-        <w:t>_maestria</w:t>
-      </w:r>
-      <w:proofErr w:type="spellEnd"/>
-      <w:r>
-        <w:rPr>
-          <w:rFonts w:ascii="Arial" w:eastAsia="Times New Roman" w:hAnsi="Arial" w:cs="Arial"/>
-          <w:sz w:val="20"/>
-          <w:szCs w:val="20"/>
-          <w:u w:val="single"/>
-          <w:lang w:eastAsia="es-ES"/>
-        </w:rPr>
-        <w:t xml:space="preserve"> }}</w:t>
+        <w:t>_maestria }}</w:t>
       </w:r>
       <w:r>
         <w:rPr>
@@ -3896,29 +3130,7 @@
           <w:u w:val="single"/>
           <w:lang w:eastAsia="es-ES"/>
         </w:rPr>
-        <w:t xml:space="preserve">{{ </w:t>
-      </w:r>
-      <w:proofErr w:type="spellStart"/>
-      <w:r>
-        <w:rPr>
-          <w:rFonts w:ascii="Arial" w:eastAsia="Times New Roman" w:hAnsi="Arial" w:cs="Arial"/>
-          <w:sz w:val="20"/>
-          <w:szCs w:val="20"/>
-          <w:u w:val="single"/>
-          <w:lang w:eastAsia="es-ES"/>
-        </w:rPr>
-        <w:t>maestria_importe</w:t>
-      </w:r>
-      <w:proofErr w:type="spellEnd"/>
-      <w:r>
-        <w:rPr>
-          <w:rFonts w:ascii="Arial" w:eastAsia="Times New Roman" w:hAnsi="Arial" w:cs="Arial"/>
-          <w:sz w:val="20"/>
-          <w:szCs w:val="20"/>
-          <w:u w:val="single"/>
-          <w:lang w:eastAsia="es-ES"/>
-        </w:rPr>
-        <w:t xml:space="preserve"> }}  </w:t>
+        <w:t xml:space="preserve">{{ maestria_importe }}  </w:t>
       </w:r>
       <w:r>
         <w:rPr>
@@ -3949,29 +3161,7 @@
           <w:u w:val="single"/>
           <w:lang w:eastAsia="es-ES"/>
         </w:rPr>
-        <w:t xml:space="preserve">{{ </w:t>
-      </w:r>
-      <w:proofErr w:type="spellStart"/>
-      <w:r>
-        <w:rPr>
-          <w:rFonts w:ascii="Arial" w:eastAsia="Times New Roman" w:hAnsi="Arial" w:cs="Arial"/>
-          <w:sz w:val="20"/>
-          <w:szCs w:val="20"/>
-          <w:u w:val="single"/>
-          <w:lang w:eastAsia="es-ES"/>
-        </w:rPr>
-        <w:t>check_doctorado</w:t>
-      </w:r>
-      <w:proofErr w:type="spellEnd"/>
-      <w:r>
-        <w:rPr>
-          <w:rFonts w:ascii="Arial" w:eastAsia="Times New Roman" w:hAnsi="Arial" w:cs="Arial"/>
-          <w:sz w:val="20"/>
-          <w:szCs w:val="20"/>
-          <w:u w:val="single"/>
-          <w:lang w:eastAsia="es-ES"/>
-        </w:rPr>
-        <w:t xml:space="preserve"> }}</w:t>
+        <w:t>{{ check_doctorado }}</w:t>
       </w:r>
       <w:r>
         <w:rPr>
@@ -4009,29 +3199,7 @@
           <w:u w:val="single"/>
           <w:lang w:eastAsia="es-ES"/>
         </w:rPr>
-        <w:t xml:space="preserve">{{ </w:t>
-      </w:r>
-      <w:proofErr w:type="spellStart"/>
-      <w:r>
-        <w:rPr>
-          <w:rFonts w:ascii="Arial" w:eastAsia="Times New Roman" w:hAnsi="Arial" w:cs="Arial"/>
-          <w:sz w:val="20"/>
-          <w:szCs w:val="20"/>
-          <w:u w:val="single"/>
-          <w:lang w:eastAsia="es-ES"/>
-        </w:rPr>
-        <w:t>doctorado_importe</w:t>
-      </w:r>
-      <w:proofErr w:type="spellEnd"/>
-      <w:r>
-        <w:rPr>
-          <w:rFonts w:ascii="Arial" w:eastAsia="Times New Roman" w:hAnsi="Arial" w:cs="Arial"/>
-          <w:sz w:val="20"/>
-          <w:szCs w:val="20"/>
-          <w:u w:val="single"/>
-          <w:lang w:eastAsia="es-ES"/>
-        </w:rPr>
-        <w:t xml:space="preserve"> }}  </w:t>
+        <w:t xml:space="preserve">{{ doctorado_importe }}  </w:t>
       </w:r>
       <w:r>
         <w:rPr>
@@ -4339,18 +3507,7 @@
           <w:u w:val="single"/>
           <w:lang w:eastAsia="es-ES"/>
         </w:rPr>
-        <w:t xml:space="preserve">{{ </w:t>
-      </w:r>
-      <w:proofErr w:type="spellStart"/>
-      <w:r>
-        <w:rPr>
-          <w:rFonts w:ascii="Arial" w:eastAsia="Times New Roman" w:hAnsi="Arial" w:cs="Arial"/>
-          <w:sz w:val="20"/>
-          <w:szCs w:val="20"/>
-          <w:u w:val="single"/>
-          <w:lang w:eastAsia="es-ES"/>
-        </w:rPr>
-        <w:t>check</w:t>
+        <w:t>{{ check</w:t>
       </w:r>
       <w:proofErr w:type="gramEnd"/>
       <w:r>
@@ -4361,18 +3518,7 @@
           <w:u w:val="single"/>
           <w:lang w:eastAsia="es-ES"/>
         </w:rPr>
-        <w:t>_pago_quincenal</w:t>
-      </w:r>
-      <w:proofErr w:type="spellEnd"/>
-      <w:r>
-        <w:rPr>
-          <w:rFonts w:ascii="Arial" w:eastAsia="Times New Roman" w:hAnsi="Arial" w:cs="Arial"/>
-          <w:sz w:val="20"/>
-          <w:szCs w:val="20"/>
-          <w:u w:val="single"/>
-          <w:lang w:eastAsia="es-ES"/>
-        </w:rPr>
-        <w:t xml:space="preserve"> }}</w:t>
+        <w:t>_pago_quincenal }}</w:t>
       </w:r>
       <w:r>
         <w:rPr>
@@ -4390,27 +3536,7 @@
           <w:szCs w:val="20"/>
           <w:lang w:eastAsia="es-ES"/>
         </w:rPr>
-        <w:t xml:space="preserve">{{ </w:t>
-      </w:r>
-      <w:proofErr w:type="spellStart"/>
-      <w:r>
-        <w:rPr>
-          <w:rFonts w:ascii="Arial" w:eastAsia="Times New Roman" w:hAnsi="Arial" w:cs="Arial"/>
-          <w:sz w:val="20"/>
-          <w:szCs w:val="20"/>
-          <w:lang w:eastAsia="es-ES"/>
-        </w:rPr>
-        <w:t>check_pago_mensual</w:t>
-      </w:r>
-      <w:proofErr w:type="spellEnd"/>
-      <w:r>
-        <w:rPr>
-          <w:rFonts w:ascii="Arial" w:eastAsia="Times New Roman" w:hAnsi="Arial" w:cs="Arial"/>
-          <w:sz w:val="20"/>
-          <w:szCs w:val="20"/>
-          <w:lang w:eastAsia="es-ES"/>
-        </w:rPr>
-        <w:t xml:space="preserve"> }}</w:t>
+        <w:t>{{ check_pago_mensual }}</w:t>
       </w:r>
       <w:r>
         <w:rPr>
@@ -4492,29 +3618,7 @@
           <w:u w:val="single"/>
           <w:lang w:eastAsia="es-ES"/>
         </w:rPr>
-        <w:t xml:space="preserve">{ </w:t>
-      </w:r>
-      <w:proofErr w:type="spellStart"/>
-      <w:r>
-        <w:rPr>
-          <w:rFonts w:ascii="Arial" w:eastAsia="Times New Roman" w:hAnsi="Arial" w:cs="Arial"/>
-          <w:sz w:val="20"/>
-          <w:szCs w:val="20"/>
-          <w:u w:val="single"/>
-          <w:lang w:eastAsia="es-ES"/>
-        </w:rPr>
-        <w:t>sistema_pago_texto</w:t>
-      </w:r>
-      <w:proofErr w:type="spellEnd"/>
-      <w:r>
-        <w:rPr>
-          <w:rFonts w:ascii="Arial" w:eastAsia="Times New Roman" w:hAnsi="Arial" w:cs="Arial"/>
-          <w:sz w:val="20"/>
-          <w:szCs w:val="20"/>
-          <w:u w:val="single"/>
-          <w:lang w:eastAsia="es-ES"/>
-        </w:rPr>
-        <w:t xml:space="preserve"> }}  </w:t>
+        <w:t xml:space="preserve">{ sistema_pago_texto }}  </w:t>
       </w:r>
       <w:r>
         <w:rPr>
@@ -5183,18 +4287,7 @@
           <w:u w:val="single"/>
           <w:lang w:eastAsia="es-ES"/>
         </w:rPr>
-        <w:t xml:space="preserve">{{ </w:t>
-      </w:r>
-      <w:proofErr w:type="spellStart"/>
-      <w:r>
-        <w:rPr>
-          <w:rFonts w:ascii="Arial" w:eastAsia="Times New Roman" w:hAnsi="Arial" w:cs="Arial"/>
-          <w:sz w:val="20"/>
-          <w:szCs w:val="20"/>
-          <w:u w:val="single"/>
-          <w:lang w:eastAsia="es-ES"/>
-        </w:rPr>
-        <w:t>resolucion</w:t>
+        <w:t>{{ resolucion</w:t>
       </w:r>
       <w:proofErr w:type="gramEnd"/>
       <w:r>
@@ -5205,18 +4298,7 @@
           <w:u w:val="single"/>
           <w:lang w:eastAsia="es-ES"/>
         </w:rPr>
-        <w:t>_nombramiento_no</w:t>
-      </w:r>
-      <w:proofErr w:type="spellEnd"/>
-      <w:r>
-        <w:rPr>
-          <w:rFonts w:ascii="Arial" w:eastAsia="Times New Roman" w:hAnsi="Arial" w:cs="Arial"/>
-          <w:sz w:val="20"/>
-          <w:szCs w:val="20"/>
-          <w:u w:val="single"/>
-          <w:lang w:eastAsia="es-ES"/>
-        </w:rPr>
-        <w:t xml:space="preserve"> }}  </w:t>
+        <w:t xml:space="preserve">_nombramiento_no }}  </w:t>
       </w:r>
       <w:r>
         <w:rPr>
@@ -5244,29 +4326,7 @@
           <w:u w:val="single"/>
           <w:lang w:eastAsia="es-ES"/>
         </w:rPr>
-        <w:t xml:space="preserve">{{ </w:t>
-      </w:r>
-      <w:proofErr w:type="spellStart"/>
-      <w:r>
-        <w:rPr>
-          <w:rFonts w:ascii="Arial" w:eastAsia="Times New Roman" w:hAnsi="Arial" w:cs="Arial"/>
-          <w:sz w:val="20"/>
-          <w:szCs w:val="20"/>
-          <w:u w:val="single"/>
-          <w:lang w:eastAsia="es-ES"/>
-        </w:rPr>
-        <w:t>check_es_funcionario</w:t>
-      </w:r>
-      <w:proofErr w:type="spellEnd"/>
-      <w:r>
-        <w:rPr>
-          <w:rFonts w:ascii="Arial" w:eastAsia="Times New Roman" w:hAnsi="Arial" w:cs="Arial"/>
-          <w:sz w:val="20"/>
-          <w:szCs w:val="20"/>
-          <w:u w:val="single"/>
-          <w:lang w:eastAsia="es-ES"/>
-        </w:rPr>
-        <w:t xml:space="preserve"> }}</w:t>
+        <w:t>{{ check_es_funcionario }}</w:t>
       </w:r>
       <w:r>
         <w:rPr>
@@ -5285,29 +4345,7 @@
           <w:u w:val="single"/>
           <w:lang w:eastAsia="es-ES"/>
         </w:rPr>
-        <w:t xml:space="preserve">{{ </w:t>
-      </w:r>
-      <w:proofErr w:type="spellStart"/>
-      <w:r>
-        <w:rPr>
-          <w:rFonts w:ascii="Arial" w:eastAsia="Times New Roman" w:hAnsi="Arial" w:cs="Arial"/>
-          <w:sz w:val="20"/>
-          <w:szCs w:val="20"/>
-          <w:u w:val="single"/>
-          <w:lang w:eastAsia="es-ES"/>
-        </w:rPr>
-        <w:t>check_es_designado</w:t>
-      </w:r>
-      <w:proofErr w:type="spellEnd"/>
-      <w:r>
-        <w:rPr>
-          <w:rFonts w:ascii="Arial" w:eastAsia="Times New Roman" w:hAnsi="Arial" w:cs="Arial"/>
-          <w:sz w:val="20"/>
-          <w:szCs w:val="20"/>
-          <w:u w:val="single"/>
-          <w:lang w:eastAsia="es-ES"/>
-        </w:rPr>
-        <w:t xml:space="preserve"> }}</w:t>
+        <w:t>{{ check_es_designado }}</w:t>
       </w:r>
       <w:r>
         <w:rPr>
@@ -5379,29 +4417,7 @@
           <w:u w:val="single"/>
           <w:lang w:eastAsia="es-ES"/>
         </w:rPr>
-        <w:t xml:space="preserve">{ </w:t>
-      </w:r>
-      <w:proofErr w:type="spellStart"/>
-      <w:r>
-        <w:rPr>
-          <w:rFonts w:ascii="Arial" w:eastAsia="Times New Roman" w:hAnsi="Arial" w:cs="Arial"/>
-          <w:sz w:val="20"/>
-          <w:szCs w:val="20"/>
-          <w:u w:val="single"/>
-          <w:lang w:eastAsia="es-ES"/>
-        </w:rPr>
-        <w:t>entidad_municipio</w:t>
-      </w:r>
-      <w:proofErr w:type="spellEnd"/>
-      <w:r>
-        <w:rPr>
-          <w:rFonts w:ascii="Arial" w:eastAsia="Times New Roman" w:hAnsi="Arial" w:cs="Arial"/>
-          <w:sz w:val="20"/>
-          <w:szCs w:val="20"/>
-          <w:u w:val="single"/>
-          <w:lang w:eastAsia="es-ES"/>
-        </w:rPr>
-        <w:t xml:space="preserve"> }}  </w:t>
+        <w:t xml:space="preserve">{ entidad_municipio }}  </w:t>
       </w:r>
       <w:r>
         <w:rPr>
@@ -5448,29 +4464,7 @@
           <w:u w:val="single"/>
           <w:lang w:eastAsia="es-ES"/>
         </w:rPr>
-        <w:t xml:space="preserve">{{ </w:t>
-      </w:r>
-      <w:proofErr w:type="spellStart"/>
-      <w:r>
-        <w:rPr>
-          <w:rFonts w:ascii="Arial" w:eastAsia="Times New Roman" w:hAnsi="Arial" w:cs="Arial"/>
-          <w:sz w:val="20"/>
-          <w:szCs w:val="20"/>
-          <w:u w:val="single"/>
-          <w:lang w:eastAsia="es-ES"/>
-        </w:rPr>
-        <w:t>firma_dia</w:t>
-      </w:r>
-      <w:proofErr w:type="spellEnd"/>
-      <w:r>
-        <w:rPr>
-          <w:rFonts w:ascii="Arial" w:eastAsia="Times New Roman" w:hAnsi="Arial" w:cs="Arial"/>
-          <w:sz w:val="20"/>
-          <w:szCs w:val="20"/>
-          <w:u w:val="single"/>
-          <w:lang w:eastAsia="es-ES"/>
-        </w:rPr>
-        <w:t xml:space="preserve"> }}  </w:t>
+        <w:t xml:space="preserve">{{ firma_dia }}  </w:t>
       </w:r>
       <w:r>
         <w:rPr>
@@ -5517,29 +4511,7 @@
           <w:u w:val="single"/>
           <w:lang w:eastAsia="es-ES"/>
         </w:rPr>
-        <w:t xml:space="preserve">{{ </w:t>
-      </w:r>
-      <w:proofErr w:type="spellStart"/>
-      <w:r>
-        <w:rPr>
-          <w:rFonts w:ascii="Arial" w:eastAsia="Times New Roman" w:hAnsi="Arial" w:cs="Arial"/>
-          <w:sz w:val="20"/>
-          <w:szCs w:val="20"/>
-          <w:u w:val="single"/>
-          <w:lang w:eastAsia="es-ES"/>
-        </w:rPr>
-        <w:t>firma_mes</w:t>
-      </w:r>
-      <w:proofErr w:type="spellEnd"/>
-      <w:r>
-        <w:rPr>
-          <w:rFonts w:ascii="Arial" w:eastAsia="Times New Roman" w:hAnsi="Arial" w:cs="Arial"/>
-          <w:sz w:val="20"/>
-          <w:szCs w:val="20"/>
-          <w:u w:val="single"/>
-          <w:lang w:eastAsia="es-ES"/>
-        </w:rPr>
-        <w:t xml:space="preserve"> }}  </w:t>
+        <w:t xml:space="preserve">{{ firma_mes }}  </w:t>
       </w:r>
       <w:r>
         <w:rPr>
@@ -5586,29 +4558,7 @@
           <w:u w:val="single"/>
           <w:lang w:eastAsia="es-ES"/>
         </w:rPr>
-        <w:t xml:space="preserve">{{ </w:t>
-      </w:r>
-      <w:proofErr w:type="spellStart"/>
-      <w:r>
-        <w:rPr>
-          <w:rFonts w:ascii="Arial" w:eastAsia="Times New Roman" w:hAnsi="Arial" w:cs="Arial"/>
-          <w:sz w:val="20"/>
-          <w:szCs w:val="20"/>
-          <w:u w:val="single"/>
-          <w:lang w:eastAsia="es-ES"/>
-        </w:rPr>
-        <w:t>firma_anno</w:t>
-      </w:r>
-      <w:proofErr w:type="spellEnd"/>
-      <w:r>
-        <w:rPr>
-          <w:rFonts w:ascii="Arial" w:eastAsia="Times New Roman" w:hAnsi="Arial" w:cs="Arial"/>
-          <w:sz w:val="20"/>
-          <w:szCs w:val="20"/>
-          <w:u w:val="single"/>
-          <w:lang w:eastAsia="es-ES"/>
-        </w:rPr>
-        <w:t xml:space="preserve"> }}  </w:t>
+        <w:t xml:space="preserve">{{ firma_anno }}  </w:t>
       </w:r>
       <w:r>
         <w:rPr>
@@ -6290,7 +5240,6 @@
   <w:style w:type="character" w:default="1" w:styleId="Fuentedeprrafopredeter">
     <w:name w:val="Default Paragraph Font"/>
     <w:uiPriority w:val="1"/>
-    <w:semiHidden/>
     <w:unhideWhenUsed/>
   </w:style>
   <w:style w:type="table" w:default="1" w:styleId="Tablanormal">

</xml_diff>